<commit_message>
Restructure to 4 sections with live rate calculator
- Drop Dreams and Travel sections; fold dreams content into the About bio
- Stories: drop Featured edits + I also edit list; vlog gallery only
- Add RateCalculator (ported and restyled to emerald/gold) at top of Rates
- Renumber: I Hello, II Stories, III Rates, IV Connect
- Scrub all em-dashes from src, scripts, README, generated docs
- Audit now passes with zero warnings (was 25)
- Regenerate intake form, service contract, and manual PDF
</commit_message>
<xml_diff>
--- a/public/audrey-baliao-service-contract.docx
+++ b/public/audrey-baliao-service-contract.docx
@@ -136,7 +136,7 @@
           <w:color w:val="0A2418"/>
           <w:sz w:val="40"/>
         </w:rPr>
-        <w:t>Service contract — video editing</w:t>
+        <w:t>Service contract for video editing</w:t>
       </w:r>
     </w:p>
     <w:p>
@@ -193,7 +193,7 @@
           <w:color w:val="606B60"/>
           <w:sz w:val="21"/>
         </w:rPr>
-        <w:t>Audrey Baliao — Philippines</w:t>
+        <w:t>Audrey Baliao, Philippines</w:t>
       </w:r>
     </w:p>
     <w:p>

</xml_diff>